<commit_message>
heap top k pattern comp
</commit_message>
<xml_diff>
--- a/3.Tree/18.Serialization and Deserialization.docx
+++ b/3.Tree/18.Serialization and Deserialization.docx
@@ -2080,19 +2080,12 @@
           <w:bCs/>
         </w:rPr>
       </w:pPr>
-    </w:p>
-    <w:p>
-      <w:pPr>
-        <w:rPr>
-          <w:b/>
-          <w:bCs/>
-        </w:rPr>
-      </w:pPr>
-      <w:r>
-        <w:rPr>
-          <w:b/>
-          <w:bCs/>
-        </w:rPr>
+      <w:r>
+        <w:rPr>
+          <w:b/>
+          <w:bCs/>
+        </w:rPr>
+        <w:lastRenderedPageBreak/>
         <w:t>CODE: TC:O(N) SC:O(N)</w:t>
       </w:r>
     </w:p>

</xml_diff>